<commit_message>
feat(sow): 6th flavor — Implementation & Maintenance (Split Pricing) (BR-7)
Adds a flavor that keeps the Implementation & Maintenance structure (SLAs,
support tiers, warranty, security) but splits the pricing into Implementation
(one-time) and Maintenance (annual / recurring) tables, each by cost category
with contingency — derived from the estimate's engine subtotals (no new schema).

- IMPL_MAINT_SPLIT in SowFlavor + SOW_FLAVORS (api + web); shares the maintenance
  narrative and structured defaults via MAINTENANCE_FLAVORS.
- Print: a split-pricing branch renders the two cost tables.
- Doc SOW-FLAVOR-6 (.md + .docx) + README; sow-flavor.spec → 32 cases.

Verified: a Split-Pricing SOW gets 4 SLAs + 90-day warranty and the two-table
pricing. api tsc + 853 tests; web tsc/eslint/format.

Co-Authored-By: Claude Opus 4.8 (1M context) <noreply@anthropic.com>
</commit_message>
<xml_diff>
--- a/docs/TEST_CASES.docx
+++ b/docs/TEST_CASES.docx
@@ -89,7 +89,7 @@
           <w:b/>
           <w:bCs/>
         </w:rPr>
-        <w:t xml:space="preserve">Total: 889 test cases across 35 suites.</w:t>
+        <w:t xml:space="preserve">Total: 891 test cases across 35 suites.</w:t>
       </w:r>
       <w:r>
         <w:t xml:space="preserve"> </w:t>
@@ -1275,7 +1275,7 @@
               <w:jc w:val="right"/>
             </w:pPr>
             <w:r>
-              <w:t xml:space="preserve">30</w:t>
+              <w:t xml:space="preserve">32</w:t>
             </w:r>
           </w:p>
         </w:tc>
@@ -1628,7 +1628,7 @@
                 <w:b/>
                 <w:bCs/>
               </w:rPr>
-              <w:t xml:space="preserve">889</w:t>
+              <w:t xml:space="preserve">891</w:t>
             </w:r>
           </w:p>
         </w:tc>
@@ -11721,7 +11721,7 @@
           <w:i/>
           <w:iCs/>
         </w:rPr>
-        <w:t xml:space="preserve">— 30 cases</w:t>
+        <w:t xml:space="preserve">— 32 cases</w:t>
       </w:r>
     </w:p>
     <w:p>
@@ -11805,7 +11805,7 @@
         </w:numPr>
       </w:pPr>
       <w:r>
-        <w:t xml:space="preserve">FL-05 lists all five flavors</w:t>
+        <w:t xml:space="preserve">FL-05 lists all six flavors</w:t>
       </w:r>
     </w:p>
     <w:p>
@@ -12154,6 +12154,30 @@
       </w:pPr>
       <w:r>
         <w:t xml:space="preserve">FL-30 warrantyDays accepts a number or null</w:t>
+      </w:r>
+    </w:p>
+    <w:p>
+      <w:pPr>
+        <w:pStyle w:val="Compact"/>
+        <w:numPr>
+          <w:ilvl w:val="0"/>
+          <w:numId w:val="1094"/>
+        </w:numPr>
+      </w:pPr>
+      <w:r>
+        <w:t xml:space="preserve">FL-31 IMPL_MAINT_SPLIT is a valid flavor</w:t>
+      </w:r>
+    </w:p>
+    <w:p>
+      <w:pPr>
+        <w:pStyle w:val="Compact"/>
+        <w:numPr>
+          <w:ilvl w:val="0"/>
+          <w:numId w:val="1094"/>
+        </w:numPr>
+      </w:pPr>
+      <w:r>
+        <w:t xml:space="preserve">FL-32 IMPL_MAINT_SPLIT is in the catalog</w:t>
       </w:r>
     </w:p>
     <w:bookmarkEnd w:id="36"/>

</xml_diff>

<commit_message>
feat(sow): 6th flavor — Implementation & Maintenance (Split Pricing) (BR-7) (#133)
Adds a flavor that keeps the Implementation & Maintenance structure (SLAs,
support tiers, warranty, security) but splits the pricing into Implementation
(one-time) and Maintenance (annual / recurring) tables, each by cost category
with contingency — derived from the estimate's engine subtotals (no new schema).

- IMPL_MAINT_SPLIT in SowFlavor + SOW_FLAVORS (api + web); shares the maintenance
  narrative and structured defaults via MAINTENANCE_FLAVORS.
- Print: a split-pricing branch renders the two cost tables.
- Doc SOW-FLAVOR-6 (.md + .docx) + README; sow-flavor.spec → 32 cases.

Verified: a Split-Pricing SOW gets 4 SLAs + 90-day warranty and the two-table
pricing. api tsc + 853 tests; web tsc/eslint/format.

Co-authored-by: Tito Morales <support@veridion.com>
Co-authored-by: Claude Opus 4.8 (1M context) <noreply@anthropic.com>
</commit_message>
<xml_diff>
--- a/docs/TEST_CASES.docx
+++ b/docs/TEST_CASES.docx
@@ -89,7 +89,7 @@
           <w:b/>
           <w:bCs/>
         </w:rPr>
-        <w:t xml:space="preserve">Total: 889 test cases across 35 suites.</w:t>
+        <w:t xml:space="preserve">Total: 891 test cases across 35 suites.</w:t>
       </w:r>
       <w:r>
         <w:t xml:space="preserve"> </w:t>
@@ -1275,7 +1275,7 @@
               <w:jc w:val="right"/>
             </w:pPr>
             <w:r>
-              <w:t xml:space="preserve">30</w:t>
+              <w:t xml:space="preserve">32</w:t>
             </w:r>
           </w:p>
         </w:tc>
@@ -1628,7 +1628,7 @@
                 <w:b/>
                 <w:bCs/>
               </w:rPr>
-              <w:t xml:space="preserve">889</w:t>
+              <w:t xml:space="preserve">891</w:t>
             </w:r>
           </w:p>
         </w:tc>
@@ -11721,7 +11721,7 @@
           <w:i/>
           <w:iCs/>
         </w:rPr>
-        <w:t xml:space="preserve">— 30 cases</w:t>
+        <w:t xml:space="preserve">— 32 cases</w:t>
       </w:r>
     </w:p>
     <w:p>
@@ -11805,7 +11805,7 @@
         </w:numPr>
       </w:pPr>
       <w:r>
-        <w:t xml:space="preserve">FL-05 lists all five flavors</w:t>
+        <w:t xml:space="preserve">FL-05 lists all six flavors</w:t>
       </w:r>
     </w:p>
     <w:p>
@@ -12154,6 +12154,30 @@
       </w:pPr>
       <w:r>
         <w:t xml:space="preserve">FL-30 warrantyDays accepts a number or null</w:t>
+      </w:r>
+    </w:p>
+    <w:p>
+      <w:pPr>
+        <w:pStyle w:val="Compact"/>
+        <w:numPr>
+          <w:ilvl w:val="0"/>
+          <w:numId w:val="1094"/>
+        </w:numPr>
+      </w:pPr>
+      <w:r>
+        <w:t xml:space="preserve">FL-31 IMPL_MAINT_SPLIT is a valid flavor</w:t>
+      </w:r>
+    </w:p>
+    <w:p>
+      <w:pPr>
+        <w:pStyle w:val="Compact"/>
+        <w:numPr>
+          <w:ilvl w:val="0"/>
+          <w:numId w:val="1094"/>
+        </w:numPr>
+      </w:pPr>
+      <w:r>
+        <w:t xml:space="preserve">FL-32 IMPL_MAINT_SPLIT is in the catalog</w:t>
       </w:r>
     </w:p>
     <w:bookmarkEnd w:id="36"/>

</xml_diff>